<commit_message>
Add MkDocs documentation setup and deployment configuration
</commit_message>
<xml_diff>
--- a/docs/Documents/AgriTwin-GH - Conference Report Content.docx
+++ b/docs/Documents/AgriTwin-GH - Conference Report Content.docx
@@ -19,7 +19,23 @@
         <w:jc w:val="both"/>
       </w:pPr>
       <w:r>
-        <w:t>Greenhouse production of high-value crops such as tomatoes and strawberries necessitates careful environmental control in order to achieve high yield, quality, and early disease prevention. AgriTwin-GH, a software-based AI-powered digital twin framework for smart greenhouse management, is presented in this project. The Greenhouse Plant Growth Metrics Dataset, Smart Agriculture Dataset, Plant Village Dataset, Tomato Plant Stages Dataset, and Ripe Strawberries Detection Dataset are just a few of the tabular time-series greenhouse datasets and plant image datasets that the system incorporates. Convolutional Neural Networks (CNN) use leaf pictures to detect plant diseases, whereas Recurrent Neural Networks (RNN) estimate disease development and future danger. In order to calculate indicators like vapor pressure deficit and disease risk indices, environmental and crop factors including temperature, humidity, CO₂ concentration, light intensity, soil moisture, pH, and nutrient levels are processed. Short-term forecasting models forecast greenhouse conditions, which are assessed using a digital twin and a Model Predictive Control (MPC) technique to generate optimal and safety-validated control actions. The system generate disease-aware predictions and simple nonverbal operational alerts, allowing for efficient, scalable, and user-friendly smart greenhouse management. By enabling early disease risk awareness and optimized resource utilization, the proposed system significantly improves crop productivity while reducing water, energy, and fertilizer waste. The AgriTwin-GH framework offers a scalable and cost-effective decision-support solution for precision greenhouse horticulture, particularly suitable for labor-intensive and resource-constrained farming environments.</w:t>
+        <w:t xml:space="preserve">Greenhouse production of high-value crops such as tomatoes and strawberries </w:t>
+      </w:r>
+      <w:proofErr w:type="gramStart"/>
+      <w:r>
+        <w:t>necessitates</w:t>
+      </w:r>
+      <w:proofErr w:type="gramEnd"/>
+      <w:r>
+        <w:t xml:space="preserve"> careful environmental control in order to achieve high yield, quality, and early disease prevention. AgriTwin-GH, a software-based AI-powered digital twin framework for smart greenhouse management, is presented in this project. The Greenhouse Plant Growth Metrics Dataset, Smart Agriculture Dataset, Plant Village Dataset, Tomato Plant Stages Dataset, and Ripe Strawberries Detection Dataset are just a few of the tabular time-series greenhouse datasets and plant image datasets that the system incorporates. Convolutional Neural Networks (CNN) use leaf pictures to detect plant diseases, whereas Recurrent Neural Networks (RNN) estimate disease development and future danger. In order to calculate indicators like vapor pressure deficit and disease risk indices, environmental and crop factors including temperature, humidity, CO₂ concentration, light intensity, soil moisture, pH, and nutrient levels are processed. Short-term forecasting models forecast greenhouse conditions, which are assessed using a digital twin and a Model Predictive Control (MPC) technique to generate optimal and safety-validated control actions. The system </w:t>
+      </w:r>
+      <w:proofErr w:type="gramStart"/>
+      <w:r>
+        <w:t>generate</w:t>
+      </w:r>
+      <w:proofErr w:type="gramEnd"/>
+      <w:r>
+        <w:t xml:space="preserve"> disease-aware predictions and simple nonverbal operational alerts, allowing for efficient, scalable, and user-friendly smart greenhouse management. By enabling early disease risk awareness and optimized resource utilization, the proposed system significantly improves crop productivity while reducing water, energy, and fertilizer waste. The AgriTwin-GH framework offers a scalable and cost-effective decision-support solution for precision greenhouse horticulture, particularly suitable for labor-intensive and resource-constrained farming environments.</w:t>
       </w:r>
     </w:p>
     <w:p>
@@ -349,8 +365,11 @@
         <w:jc w:val="both"/>
       </w:pPr>
       <w:r>
+        <w:rPr>
+          <w:noProof/>
+        </w:rPr>
         <w:drawing>
-          <wp:inline distT="0" distB="0" distL="0" distR="0" wp14:anchorId="08C715E7" wp14:editId="390B50F1">
+          <wp:inline distT="0" distB="0" distL="0" distR="0" wp14:anchorId="08C715E7" wp14:editId="011A9F64">
             <wp:extent cx="5731510" cy="2532380"/>
             <wp:effectExtent l="0" t="0" r="2540" b="1270"/>
             <wp:docPr id="3" name="Picture 3"/>
@@ -800,7 +819,7 @@
           <w:bdr w:val="none" w:sz="0" w:space="0" w:color="auto" w:frame="1"/>
         </w:rPr>
         <w:drawing>
-          <wp:inline distT="0" distB="0" distL="0" distR="0" wp14:anchorId="102B5AF9" wp14:editId="6284FB10">
+          <wp:inline distT="0" distB="0" distL="0" distR="0" wp14:anchorId="102B5AF9" wp14:editId="522218B4">
             <wp:extent cx="5724525" cy="838200"/>
             <wp:effectExtent l="0" t="0" r="9525" b="0"/>
             <wp:docPr id="6" name="Picture 6"/>
@@ -1557,6 +1576,320 @@
           <w:b/>
           <w:bCs/>
         </w:rPr>
+        <w:t>RESULT ANALYSIS</w:t>
+      </w:r>
+    </w:p>
+    <w:p>
+      <w:pPr>
+        <w:jc w:val="both"/>
+      </w:pPr>
+      <w:r>
+        <w:t xml:space="preserve">The experimental evaluation was carried out using the AgriTwin-GH feature demonstrations implemented in Jupyter notebooks, where a multi-parameter greenhouse time-series was generated and processed to reproduce baseline monitoring </w:t>
+      </w:r>
+      <w:r>
+        <w:lastRenderedPageBreak/>
+        <w:t>behavior and then extend it with predictive analytics, risk-aware control, and outcome comparison. The results are presented with three figures to keep the discussion directly comparable with existing monitoring-oriented systems, while still highlighting the additional outcomes enabled by the proposed digital-twin workflow.</w:t>
+      </w:r>
+    </w:p>
+    <w:p>
+      <w:pPr>
+        <w:jc w:val="both"/>
+      </w:pPr>
+      <w:r>
+        <w:t xml:space="preserve">Fig. </w:t>
+      </w:r>
+      <w:r>
+        <w:t>7</w:t>
+      </w:r>
+      <w:r>
+        <w:t xml:space="preserve"> illustrates the baseline-compatible environmental monitoring view by plotting air temperature and relative humidity over time in a format typically used in conventional greenhouse dashboards. The temperature trajectory shows a stable diurnal pattern with periodic peaks and troughs, reflecting day–night variations. In parallel, the humidity curve exhibits the expected inverse tendency relative to temperature, with a marked reference line indicating a high-risk humidity threshold. This figure is intentionally aligned with “existing system” behavior: it demonstrates that AgriTwin-GH retains the same fundamental capability of continuous temperature–humidity tracking and threshold-based visibility, enabling direct one-to-one comparison with baseline monitoring solutions that primarily stop at visualization and simple limits.</w:t>
+      </w:r>
+    </w:p>
+    <w:p>
+      <w:pPr>
+        <w:jc w:val="both"/>
+      </w:pPr>
+      <w:r>
+        <w:drawing>
+          <wp:inline distT="0" distB="0" distL="0" distR="0" wp14:anchorId="7846A502" wp14:editId="0E0DF231">
+            <wp:extent cx="5731510" cy="3251835"/>
+            <wp:effectExtent l="0" t="0" r="2540" b="5715"/>
+            <wp:docPr id="9" name="Picture 9"/>
+            <wp:cNvGraphicFramePr>
+              <a:graphicFrameLocks xmlns:a="http://schemas.openxmlformats.org/drawingml/2006/main" noChangeAspect="1"/>
+            </wp:cNvGraphicFramePr>
+            <a:graphic xmlns:a="http://schemas.openxmlformats.org/drawingml/2006/main">
+              <a:graphicData uri="http://schemas.openxmlformats.org/drawingml/2006/picture">
+                <pic:pic xmlns:pic="http://schemas.openxmlformats.org/drawingml/2006/picture">
+                  <pic:nvPicPr>
+                    <pic:cNvPr id="1" name=""/>
+                    <pic:cNvPicPr/>
+                  </pic:nvPicPr>
+                  <pic:blipFill>
+                    <a:blip r:embed="rId11"/>
+                    <a:stretch>
+                      <a:fillRect/>
+                    </a:stretch>
+                  </pic:blipFill>
+                  <pic:spPr>
+                    <a:xfrm>
+                      <a:off x="0" y="0"/>
+                      <a:ext cx="5731510" cy="3251835"/>
+                    </a:xfrm>
+                    <a:prstGeom prst="rect">
+                      <a:avLst/>
+                    </a:prstGeom>
+                  </pic:spPr>
+                </pic:pic>
+              </a:graphicData>
+            </a:graphic>
+          </wp:inline>
+        </w:drawing>
+      </w:r>
+    </w:p>
+    <w:p>
+      <w:pPr>
+        <w:jc w:val="center"/>
+      </w:pPr>
+      <w:r>
+        <w:t xml:space="preserve">Fig. </w:t>
+      </w:r>
+      <w:r>
+        <w:t>7</w:t>
+      </w:r>
+      <w:r>
+        <w:t xml:space="preserve"> </w:t>
+      </w:r>
+      <w:r>
+        <w:t>Baseline-Compatible Temperature and Humidity Monitoring</w:t>
+      </w:r>
+    </w:p>
+    <w:p>
+      <w:pPr>
+        <w:jc w:val="both"/>
+      </w:pPr>
+      <w:r>
+        <w:t xml:space="preserve">Building on the baseline visibility, Fig. </w:t>
+      </w:r>
+      <w:r>
+        <w:t>8</w:t>
+      </w:r>
+      <w:r>
+        <w:t xml:space="preserve"> reports the disease intelligence layer introduced in AgriTwin-GH through a risk indexing mechanism derived from environmental exposure patterns. Fig. </w:t>
+      </w:r>
+      <w:r>
+        <w:t>8</w:t>
+      </w:r>
+      <w:r>
+        <w:t xml:space="preserve">(A) shows a unified Disease Risk Index, where the index remains mostly within the safe-to-moderate region and is interpreted in relation to medium/high thresholds and highlighted critical zones. Fig. </w:t>
+      </w:r>
+      <w:r>
+        <w:t>8</w:t>
+      </w:r>
+      <w:r>
+        <w:t xml:space="preserve">(B) further decomposes the unified index into disease-specific risk scores (e.g., leaf mold and spider mites), demonstrating that the system does not treat “disease risk” as a single generic alarm; instead, it separates risk signatures that arise under different environmental conditions. Finally, Fig. </w:t>
+      </w:r>
+      <w:r>
+        <w:t>8</w:t>
+      </w:r>
+      <w:r>
+        <w:t>(C) summarizes cumulative high-humidity exposure (risk budget), which captures duration-</w:t>
+      </w:r>
+      <w:r>
+        <w:lastRenderedPageBreak/>
+        <w:t xml:space="preserve">based stress rather than instantaneous spikes alone. This is important for greenhouse pathology because sustained exposure windows are often more informative than single-point threshold crossings. In comparison terms, the existing monitoring-style approach in Fig. </w:t>
+      </w:r>
+      <w:r>
+        <w:t>7</w:t>
+      </w:r>
+      <w:r>
+        <w:t xml:space="preserve"> can reveal “what happened” (humidity crossing a line), whereas Fig. </w:t>
+      </w:r>
+      <w:r>
+        <w:t>8</w:t>
+      </w:r>
+      <w:r>
+        <w:t xml:space="preserve"> provides structured evidence of why it matters (risk accumulation) and what it implies (disease-specific risk characterization), which becomes directly actionable for control decisions.</w:t>
+      </w:r>
+    </w:p>
+    <w:p>
+      <w:pPr>
+        <w:jc w:val="center"/>
+      </w:pPr>
+      <w:r>
+        <w:drawing>
+          <wp:inline distT="0" distB="0" distL="0" distR="0" wp14:anchorId="6D270CDD" wp14:editId="1EEA5D64">
+            <wp:extent cx="5731510" cy="4070350"/>
+            <wp:effectExtent l="0" t="0" r="2540" b="6350"/>
+            <wp:docPr id="4" name="Picture 4"/>
+            <wp:cNvGraphicFramePr>
+              <a:graphicFrameLocks xmlns:a="http://schemas.openxmlformats.org/drawingml/2006/main" noChangeAspect="1"/>
+            </wp:cNvGraphicFramePr>
+            <a:graphic xmlns:a="http://schemas.openxmlformats.org/drawingml/2006/main">
+              <a:graphicData uri="http://schemas.openxmlformats.org/drawingml/2006/picture">
+                <pic:pic xmlns:pic="http://schemas.openxmlformats.org/drawingml/2006/picture">
+                  <pic:nvPicPr>
+                    <pic:cNvPr id="1" name=""/>
+                    <pic:cNvPicPr/>
+                  </pic:nvPicPr>
+                  <pic:blipFill>
+                    <a:blip r:embed="rId12"/>
+                    <a:stretch>
+                      <a:fillRect/>
+                    </a:stretch>
+                  </pic:blipFill>
+                  <pic:spPr>
+                    <a:xfrm>
+                      <a:off x="0" y="0"/>
+                      <a:ext cx="5731510" cy="4070350"/>
+                    </a:xfrm>
+                    <a:prstGeom prst="rect">
+                      <a:avLst/>
+                    </a:prstGeom>
+                  </pic:spPr>
+                </pic:pic>
+              </a:graphicData>
+            </a:graphic>
+          </wp:inline>
+        </w:drawing>
+      </w:r>
+    </w:p>
+    <w:p>
+      <w:pPr>
+        <w:jc w:val="center"/>
+      </w:pPr>
+      <w:r>
+        <w:t xml:space="preserve">Fig. </w:t>
+      </w:r>
+      <w:r>
+        <w:t>8</w:t>
+      </w:r>
+      <w:r>
+        <w:t xml:space="preserve"> </w:t>
+      </w:r>
+      <w:r>
+        <w:t>Disease Risk Index and Exposure Analysis</w:t>
+      </w:r>
+    </w:p>
+    <w:p>
+      <w:pPr>
+        <w:jc w:val="both"/>
+      </w:pPr>
+      <w:r>
+        <w:t xml:space="preserve">Fig. </w:t>
+      </w:r>
+      <w:r>
+        <w:t>9</w:t>
+      </w:r>
+      <w:r>
+        <w:t xml:space="preserve"> presents the core outcome comparison that distinguishes AgriTwin-GH from baseline systems: controlled vs. uncontrolled greenhouse management over a representative 7-day period. Fig. </w:t>
+      </w:r>
+      <w:r>
+        <w:t>9</w:t>
+      </w:r>
+      <w:r>
+        <w:t xml:space="preserve">(A) shows that closed-loop control produces a tighter temperature trajectory compared with the uncontrolled case, indicating improved setpoint tracking and reduced drift. Fig. </w:t>
+      </w:r>
+      <w:r>
+        <w:t>9</w:t>
+      </w:r>
+      <w:r>
+        <w:t xml:space="preserve">(B) similarly demonstrates humidity regulation relative to the marked critical threshold, where the controlled profile remains more consistently within the safe operating band. Fig. </w:t>
+      </w:r>
+      <w:r>
+        <w:t>9</w:t>
+      </w:r>
+      <w:r>
+        <w:t xml:space="preserve">(C) links these improvements to the intended objective by showing disease risk reduction under control, where the controlled risk curve stays suppressed relative to the uncontrolled curve and avoids risk excursions. Fig. </w:t>
+      </w:r>
+      <w:r>
+        <w:t>9</w:t>
+      </w:r>
+      <w:r>
+        <w:t xml:space="preserve">(D) complements the climate and risk results by showing soil moisture behavior with irrigation control, illustrating how actuator logic stabilizes moisture around an operational trigger threshold instead of allowing wide depletion/recovery swings. Overall, this figure provides a direct, report-ready comparison: baseline monitoring can only </w:t>
+      </w:r>
+      <w:r>
+        <w:lastRenderedPageBreak/>
+        <w:t>display deviations, while AgriTwin-GH demonstrates measurable improvement in stability and risk containment through a digital-twin-informed control policy, which is the key requirement for a meaningful “system outcome” beyond visualization.</w:t>
+      </w:r>
+    </w:p>
+    <w:p>
+      <w:pPr>
+        <w:jc w:val="both"/>
+      </w:pPr>
+      <w:r>
+        <w:drawing>
+          <wp:inline distT="0" distB="0" distL="0" distR="0" wp14:anchorId="56608276" wp14:editId="6464779F">
+            <wp:extent cx="5731510" cy="4916805"/>
+            <wp:effectExtent l="0" t="0" r="2540" b="0"/>
+            <wp:docPr id="2" name="Picture 2"/>
+            <wp:cNvGraphicFramePr>
+              <a:graphicFrameLocks xmlns:a="http://schemas.openxmlformats.org/drawingml/2006/main" noChangeAspect="1"/>
+            </wp:cNvGraphicFramePr>
+            <a:graphic xmlns:a="http://schemas.openxmlformats.org/drawingml/2006/main">
+              <a:graphicData uri="http://schemas.openxmlformats.org/drawingml/2006/picture">
+                <pic:pic xmlns:pic="http://schemas.openxmlformats.org/drawingml/2006/picture">
+                  <pic:nvPicPr>
+                    <pic:cNvPr id="1" name=""/>
+                    <pic:cNvPicPr/>
+                  </pic:nvPicPr>
+                  <pic:blipFill>
+                    <a:blip r:embed="rId13"/>
+                    <a:stretch>
+                      <a:fillRect/>
+                    </a:stretch>
+                  </pic:blipFill>
+                  <pic:spPr>
+                    <a:xfrm>
+                      <a:off x="0" y="0"/>
+                      <a:ext cx="5731510" cy="4916805"/>
+                    </a:xfrm>
+                    <a:prstGeom prst="rect">
+                      <a:avLst/>
+                    </a:prstGeom>
+                  </pic:spPr>
+                </pic:pic>
+              </a:graphicData>
+            </a:graphic>
+          </wp:inline>
+        </w:drawing>
+      </w:r>
+    </w:p>
+    <w:p>
+      <w:pPr>
+        <w:jc w:val="center"/>
+      </w:pPr>
+      <w:r>
+        <w:t xml:space="preserve">Fig. </w:t>
+      </w:r>
+      <w:r>
+        <w:t>9</w:t>
+      </w:r>
+      <w:r>
+        <w:t xml:space="preserve"> </w:t>
+      </w:r>
+      <w:r>
+        <w:t>Controlled vs. Uncontrolled Greenhouse Performance</w:t>
+      </w:r>
+    </w:p>
+    <w:p>
+      <w:pPr>
+        <w:jc w:val="center"/>
+      </w:pPr>
+    </w:p>
+    <w:p>
+      <w:pPr>
+        <w:jc w:val="both"/>
+        <w:rPr>
+          <w:b/>
+          <w:bCs/>
+        </w:rPr>
+      </w:pPr>
+      <w:r>
+        <w:rPr>
+          <w:b/>
+          <w:bCs/>
+        </w:rPr>
         <w:t>CONCLUSION</w:t>
       </w:r>
       <w:r>
@@ -1582,26 +1915,23 @@
         <w:t>AgriTwin-GH</w:t>
       </w:r>
       <w:r>
-        <w:t xml:space="preserve"> framework demonstrates the effectiveness of a software-based, AI-driven digital twin for intelligent greenhouse management in tomato and strawberry cultivation. By integrating environmental analytics, image-based disease </w:t>
-      </w:r>
+        <w:t xml:space="preserve"> framework demonstrates the effectiveness of a software-based, AI-driven digital twin for intelligent greenhouse management in tomato and strawberry cultivation. By integrating environmental analytics, image-based disease detection, and virtual greenhouse modeling, the system enables a shift from reactive control to predictive, simulation-validated decision-making.</w:t>
+      </w:r>
+    </w:p>
+    <w:p>
+      <w:pPr>
+        <w:jc w:val="both"/>
+      </w:pPr>
+      <w:r>
+        <w:t>Unlike conventional systems that act after visible stress appears, AgriTwin-GH continuously analyzes multi-modal data to detect early crop stress and disease risk. AI models infer crop health, growth stages, and potential disease progression, while the digital twin validates control strategies under agronomic and safety constraints.</w:t>
+      </w:r>
+    </w:p>
+    <w:p>
+      <w:pPr>
+        <w:jc w:val="both"/>
+      </w:pPr>
       <w:r>
         <w:lastRenderedPageBreak/>
-        <w:t>detection, and virtual greenhouse modeling, the system enables a shift from reactive control to predictive, simulation-validated decision-making.</w:t>
-      </w:r>
-    </w:p>
-    <w:p>
-      <w:pPr>
-        <w:jc w:val="both"/>
-      </w:pPr>
-      <w:r>
-        <w:t>Unlike conventional systems that act after visible stress appears, AgriTwin-GH continuously analyzes multi-modal data to detect early crop stress and disease risk. AI models infer crop health, growth stages, and potential disease progression, while the digital twin validates control strategies under agronomic and safety constraints.</w:t>
-      </w:r>
-    </w:p>
-    <w:p>
-      <w:pPr>
-        <w:jc w:val="both"/>
-      </w:pPr>
-      <w:r>
         <w:t>A key contribution is the sensor-independent digital twin paradigm, where open-source datasets function as virtual sensor streams. This reduces infrastructure dependency while maintaining realistic greenhouse representation. The results confirm that the framework effectively supports climate regulation, irrigation scheduling, and disease risk mitigation.</w:t>
       </w:r>
       <w:r>
@@ -1719,7 +2049,6 @@
         <w:jc w:val="both"/>
       </w:pPr>
       <w:r>
-        <w:lastRenderedPageBreak/>
         <w:t xml:space="preserve">[5] D. K. Lee, B. K. Kang, Y. J. Kim, T. G. An, and Y. T. Chae, “A digital twin-based framework for precision tomato cultivation: Integrating XGBoost-based prediction with model predictive control,” </w:t>
       </w:r>
       <w:r>
@@ -1774,6 +2103,7 @@
         <w:jc w:val="both"/>
       </w:pPr>
       <w:r>
+        <w:lastRenderedPageBreak/>
         <w:t xml:space="preserve">[8] A. Oad, S. S. Abbas, A. Zafar, and others, “Plant leaf disease detection using ensemble learning and explainable AI,” </w:t>
       </w:r>
       <w:r>

</xml_diff>